<commit_message>
v21.2 CRITICAL FIXES: 1) AI now directly executes bulk student lists (parses V-XXXXX format automatically), 2) Robust line-by-line PROPOSAL JSON extraction, 3) Excel import supports Identidad/Nombre_Completo/Seccion columns, 4) Favicon set to institutional logo, 5) Page title updated
</commit_message>
<xml_diff>
--- a/andresbello.docx
+++ b/andresbello.docx
@@ -20,6 +20,7 @@
           <w:sz w:val="24"/>
         </w:rPr>
       </w:pPr>
+      <w:bookmarkStart w:id="0" w:name="_GoBack"/>
       <w:r>
         <w:rPr>
           <w:rFonts w:ascii="Arial" w:hAnsi="Arial"/>
@@ -72,6 +73,7 @@
           </wp:anchor>
         </w:drawing>
       </w:r>
+      <w:bookmarkEnd w:id="0"/>
       <w:r>
         <w:rPr>
           <w:rFonts w:ascii="Arial" w:hAnsi="Arial"/>
@@ -757,7 +759,25 @@
           <w:b/>
           <w:sz w:val="24"/>
         </w:rPr>
-        <w:t>S. Romero, M. Santeliz, L.</w:t>
+        <w:t xml:space="preserve">S. Romero, M. </w:t>
+      </w:r>
+      <w:proofErr w:type="spellStart"/>
+      <w:r>
+        <w:rPr>
+          <w:rFonts w:ascii="Arial" w:hAnsi="Arial"/>
+          <w:b/>
+          <w:sz w:val="24"/>
+        </w:rPr>
+        <w:t>Santeliz</w:t>
+      </w:r>
+      <w:proofErr w:type="spellEnd"/>
+      <w:r>
+        <w:rPr>
+          <w:rFonts w:ascii="Arial" w:hAnsi="Arial"/>
+          <w:b/>
+          <w:sz w:val="24"/>
+        </w:rPr>
+        <w:t>, L.</w:t>
       </w:r>
     </w:p>
     <w:p>
@@ -818,13 +838,23 @@
           <w:sz w:val="24"/>
         </w:rPr>
       </w:pPr>
+      <w:proofErr w:type="spellStart"/>
       <w:r>
         <w:rPr>
           <w:rFonts w:ascii="Arial"/>
           <w:b/>
           <w:sz w:val="24"/>
         </w:rPr>
-        <w:t>Tona,</w:t>
+        <w:t>Tona</w:t>
+      </w:r>
+      <w:proofErr w:type="spellEnd"/>
+      <w:r>
+        <w:rPr>
+          <w:rFonts w:ascii="Arial"/>
+          <w:b/>
+          <w:sz w:val="24"/>
+        </w:rPr>
+        <w:t>,</w:t>
       </w:r>
       <w:r>
         <w:rPr>
@@ -977,6 +1007,10 @@
     </w:p>
     <w:sdt>
       <w:sdtPr>
+        <w:rPr>
+          <w:b/>
+          <w:u w:val="single"/>
+        </w:rPr>
         <w:id w:val="-1054312487"/>
         <w:docPartObj>
           <w:docPartGallery w:val="Table of Contents"/>
@@ -992,29 +1026,47 @@
               <w:tab w:val="right" w:leader="dot" w:pos="10071"/>
             </w:tabs>
             <w:spacing w:before="22"/>
+            <w:rPr>
+              <w:b/>
+              <w:u w:val="single"/>
+            </w:rPr>
           </w:pPr>
           <w:hyperlink w:anchor="_bookmark0" w:history="1">
             <w:r>
+              <w:rPr>
+                <w:b/>
+                <w:u w:val="single"/>
+              </w:rPr>
               <w:t>MOMENTO</w:t>
             </w:r>
             <w:r>
               <w:rPr>
+                <w:b/>
                 <w:spacing w:val="-4"/>
+                <w:u w:val="single"/>
               </w:rPr>
               <w:t xml:space="preserve"> </w:t>
             </w:r>
             <w:r>
               <w:rPr>
+                <w:b/>
                 <w:spacing w:val="-10"/>
+                <w:u w:val="single"/>
               </w:rPr>
               <w:t>I</w:t>
             </w:r>
             <w:r>
+              <w:rPr>
+                <w:b/>
+                <w:u w:val="single"/>
+              </w:rPr>
               <w:tab/>
             </w:r>
             <w:r>
               <w:rPr>
+                <w:b/>
                 <w:spacing w:val="-10"/>
+                <w:u w:val="single"/>
               </w:rPr>
               <w:t>4</w:t>
             </w:r>
@@ -1175,29 +1227,47 @@
               <w:tab w:val="right" w:leader="dot" w:pos="10071"/>
             </w:tabs>
             <w:spacing w:before="120"/>
+            <w:rPr>
+              <w:b/>
+              <w:u w:val="single"/>
+            </w:rPr>
           </w:pPr>
           <w:hyperlink w:anchor="_bookmark5" w:history="1">
             <w:r>
+              <w:rPr>
+                <w:b/>
+                <w:u w:val="single"/>
+              </w:rPr>
               <w:t>MOMENTO</w:t>
             </w:r>
             <w:r>
               <w:rPr>
+                <w:b/>
                 <w:spacing w:val="-4"/>
+                <w:u w:val="single"/>
               </w:rPr>
               <w:t xml:space="preserve"> </w:t>
             </w:r>
             <w:r>
               <w:rPr>
+                <w:b/>
                 <w:spacing w:val="-5"/>
+                <w:u w:val="single"/>
               </w:rPr>
               <w:t>II</w:t>
             </w:r>
             <w:r>
+              <w:rPr>
+                <w:b/>
+                <w:u w:val="single"/>
+              </w:rPr>
               <w:tab/>
             </w:r>
             <w:r>
               <w:rPr>
+                <w:b/>
                 <w:spacing w:val="-10"/>
+                <w:u w:val="single"/>
               </w:rPr>
               <w:t>9</w:t>
             </w:r>
@@ -1902,29 +1972,47 @@
             <w:tabs>
               <w:tab w:val="right" w:leader="dot" w:pos="10071"/>
             </w:tabs>
+            <w:rPr>
+              <w:b/>
+              <w:u w:val="single"/>
+            </w:rPr>
           </w:pPr>
           <w:hyperlink w:anchor="_bookmark20" w:history="1">
             <w:r>
+              <w:rPr>
+                <w:b/>
+                <w:u w:val="single"/>
+              </w:rPr>
               <w:t>MOMENTO</w:t>
             </w:r>
             <w:r>
               <w:rPr>
+                <w:b/>
                 <w:spacing w:val="-4"/>
+                <w:u w:val="single"/>
               </w:rPr>
               <w:t xml:space="preserve"> </w:t>
             </w:r>
             <w:r>
               <w:rPr>
+                <w:b/>
                 <w:spacing w:val="-5"/>
+                <w:u w:val="single"/>
               </w:rPr>
               <w:t>III</w:t>
             </w:r>
             <w:r>
+              <w:rPr>
+                <w:b/>
+                <w:u w:val="single"/>
+              </w:rPr>
               <w:tab/>
             </w:r>
             <w:r>
               <w:rPr>
+                <w:b/>
                 <w:spacing w:val="-5"/>
+                <w:u w:val="single"/>
               </w:rPr>
               <w:t>21</w:t>
             </w:r>
@@ -2506,20 +2594,32 @@
             <w:tabs>
               <w:tab w:val="right" w:leader="dot" w:pos="10071"/>
             </w:tabs>
+            <w:rPr>
+              <w:b/>
+              <w:u w:val="single"/>
+            </w:rPr>
           </w:pPr>
           <w:hyperlink w:anchor="_bookmark34" w:history="1">
             <w:r>
               <w:rPr>
+                <w:b/>
                 <w:spacing w:val="-2"/>
+                <w:u w:val="single"/>
               </w:rPr>
               <w:t>REFERENCIAS</w:t>
             </w:r>
             <w:r>
+              <w:rPr>
+                <w:b/>
+                <w:u w:val="single"/>
+              </w:rPr>
               <w:tab/>
             </w:r>
             <w:r>
               <w:rPr>
+                <w:b/>
                 <w:spacing w:val="-5"/>
+                <w:u w:val="single"/>
               </w:rPr>
               <w:t>30</w:t>
             </w:r>
@@ -2548,8 +2648,8 @@
           <w:sz w:val="24"/>
         </w:rPr>
       </w:pPr>
-      <w:bookmarkStart w:id="0" w:name="_bookmark0"/>
-      <w:bookmarkEnd w:id="0"/>
+      <w:bookmarkStart w:id="1" w:name="_bookmark0"/>
+      <w:bookmarkEnd w:id="1"/>
       <w:r>
         <w:rPr>
           <w:b/>
@@ -2661,7 +2761,35 @@
         <w:rPr>
           <w:b w:val="0"/>
         </w:rPr>
-        <w:t>La escolaridad es un proceso acumulativo donde cada día de clase contribuye a una buena comprensión continua. García, E. y Weiss, E. (2023) explican que “asistir regularmente a clases favorece desarrollar habilidades sociales, emocionales y de disciplina, así como la participación en las actividades prácticas y el acceso a recursos educativos que no se obtienen de manera independiente” (p. 2). En este sentido, Eskoufias, E., y Parker, S.W. (2001) plantean:</w:t>
+        <w:t xml:space="preserve">La escolaridad es un proceso acumulativo donde cada día de clase contribuye a una buena comprensión continua. García, E. y </w:t>
+      </w:r>
+      <w:proofErr w:type="spellStart"/>
+      <w:r>
+        <w:rPr>
+          <w:b w:val="0"/>
+        </w:rPr>
+        <w:t>Weiss</w:t>
+      </w:r>
+      <w:proofErr w:type="spellEnd"/>
+      <w:r>
+        <w:rPr>
+          <w:b w:val="0"/>
+        </w:rPr>
+        <w:t xml:space="preserve">, E. (2023) explican que “asistir regularmente a clases favorece desarrollar habilidades sociales, emocionales y de disciplina, así como la participación en las actividades prácticas y el acceso a recursos educativos que no se obtienen de manera independiente” (p. 2). En este sentido, </w:t>
+      </w:r>
+      <w:proofErr w:type="spellStart"/>
+      <w:r>
+        <w:rPr>
+          <w:b w:val="0"/>
+        </w:rPr>
+        <w:t>Eskoufias</w:t>
+      </w:r>
+      <w:proofErr w:type="spellEnd"/>
+      <w:r>
+        <w:rPr>
+          <w:b w:val="0"/>
+        </w:rPr>
+        <w:t>, E., y Parker, S.W. (2001) plantean:</w:t>
       </w:r>
     </w:p>
     <w:p>
@@ -2743,7 +2871,21 @@
         <w:rPr>
           <w:b w:val="0"/>
         </w:rPr>
-        <w:t>Desde la perspectiva de la gestión del tiempo, el proceso manual o semiautomatizado de asistencia impone una carga administrativa innecesaria sobre el personal docente. Cada minuto invertido en el registro manual y la posterior conciliación de datos es tiempo sustraído de la planificación de clases o del acompañamiento directo a los estudiantes. Entre tanto, y ligado al planteamiento anterior, la fiabilidad y accesibilidad de la información toman un rol fundamental ya que, cuando los datos de asistencia no son consolidados en tiempo real y con precisión, la directiva y los orientadores carecen de la base empírica necesaria para tomar decisiones informadas sobre intervenciones pedagógicas o disciplinarias.</w:t>
+        <w:t xml:space="preserve">Desde la perspectiva de la gestión del tiempo, el proceso manual o </w:t>
+      </w:r>
+      <w:proofErr w:type="spellStart"/>
+      <w:r>
+        <w:rPr>
+          <w:b w:val="0"/>
+        </w:rPr>
+        <w:t>semiautomatizado</w:t>
+      </w:r>
+      <w:proofErr w:type="spellEnd"/>
+      <w:r>
+        <w:rPr>
+          <w:b w:val="0"/>
+        </w:rPr>
+        <w:t xml:space="preserve"> de asistencia impone una carga administrativa innecesaria sobre el personal docente. Cada minuto invertido en el registro manual y la posterior conciliación de datos es tiempo sustraído de la planificación de clases o del acompañamiento directo a los estudiantes. Entre tanto, y ligado al planteamiento anterior, la fiabilidad y accesibilidad de la información toman un rol fundamental ya que, cuando los datos de asistencia no son consolidados en tiempo real y con precisión, la directiva y los orientadores carecen de la base empírica necesaria para tomar decisiones informadas sobre intervenciones pedagógicas o disciplinarias.</w:t>
       </w:r>
     </w:p>
     <w:p>
@@ -2950,8 +3092,8 @@
           <w:bCs w:val="0"/>
         </w:rPr>
       </w:pPr>
-      <w:bookmarkStart w:id="1" w:name="_bookmark3"/>
-      <w:bookmarkEnd w:id="1"/>
+      <w:bookmarkStart w:id="2" w:name="_bookmark3"/>
+      <w:bookmarkEnd w:id="2"/>
       <w:r>
         <w:rPr>
           <w:bCs w:val="0"/>
@@ -3038,42 +3180,46 @@
     <w:p>
       <w:pPr>
         <w:pStyle w:val="Ttulo2"/>
-        <w:numPr>
-          <w:ilvl w:val="0"/>
-          <w:numId w:val="4"/>
-        </w:numPr>
         <w:spacing w:line="360" w:lineRule="auto"/>
         <w:jc w:val="left"/>
         <w:rPr>
-          <w:lang w:val="es-VE"/>
-        </w:rPr>
-      </w:pPr>
-      <w:r>
-        <w:rPr>
           <w:b w:val="0"/>
           <w:bCs w:val="0"/>
         </w:rPr>
-        <w:t>Validar a través de juicio de expertos la pertinencia y funcionabilidad del diseño de la plataforma propuesta.</w:t>
-      </w:r>
-    </w:p>
-    <w:p>
-      <w:pPr>
-        <w:pStyle w:val="Textoindependiente"/>
-        <w:spacing w:before="275"/>
-        <w:ind w:left="0"/>
+      </w:pPr>
+    </w:p>
+    <w:p>
+      <w:pPr>
+        <w:pStyle w:val="Ttulo2"/>
+        <w:spacing w:line="360" w:lineRule="auto"/>
         <w:jc w:val="left"/>
-      </w:pPr>
-    </w:p>
-    <w:p>
-      <w:pPr>
-        <w:pStyle w:val="Ttulo2"/>
+        <w:rPr>
+          <w:b w:val="0"/>
+          <w:bCs w:val="0"/>
+        </w:rPr>
+      </w:pPr>
+    </w:p>
+    <w:p>
+      <w:pPr>
+        <w:pStyle w:val="Ttulo2"/>
+        <w:spacing w:line="360" w:lineRule="auto"/>
         <w:jc w:val="left"/>
         <w:rPr>
-          <w:spacing w:val="-2"/>
-        </w:rPr>
-      </w:pPr>
-      <w:bookmarkStart w:id="2" w:name="_bookmark4"/>
-      <w:bookmarkEnd w:id="2"/>
+          <w:b w:val="0"/>
+          <w:bCs w:val="0"/>
+        </w:rPr>
+      </w:pPr>
+    </w:p>
+    <w:p>
+      <w:pPr>
+        <w:pStyle w:val="Ttulo2"/>
+        <w:jc w:val="left"/>
+        <w:rPr>
+          <w:spacing w:val="-2"/>
+        </w:rPr>
+      </w:pPr>
+      <w:bookmarkStart w:id="3" w:name="_bookmark4"/>
+      <w:bookmarkEnd w:id="3"/>
       <w:r>
         <w:rPr>
           <w:spacing w:val="-2"/>
@@ -3106,34 +3252,66 @@
           <w:b w:val="0"/>
           <w:lang w:val="es-VE"/>
         </w:rPr>
-        <w:t>Los actuales procesos manuales o semiautomatizados generan una carga de trabajo innecesaria en el personal administrativo y docente, retrasan la toma de decisiones oportunas y limitan la capacidad de generar estadísticas y reportes en tiempo real. La eficiencia operativa es uno de los factores determinantes en la gestión y control de asistencia, ya que postula que la optimización de los flujos de trabajo mediante la tecnología incrementa la productividad y reduce los costos indirectos.</w:t>
-      </w:r>
-    </w:p>
-    <w:p>
-      <w:pPr>
-        <w:pStyle w:val="Ttulo2"/>
-        <w:spacing w:line="360" w:lineRule="auto"/>
-        <w:rPr>
-          <w:b w:val="0"/>
-          <w:lang w:val="es-VE"/>
-        </w:rPr>
-      </w:pPr>
-    </w:p>
-    <w:p>
-      <w:pPr>
-        <w:pStyle w:val="Ttulo2"/>
-        <w:spacing w:line="360" w:lineRule="auto"/>
-        <w:rPr>
-          <w:b w:val="0"/>
-          <w:lang w:val="es-VE"/>
-        </w:rPr>
-      </w:pPr>
-      <w:r>
-        <w:rPr>
-          <w:b w:val="0"/>
-          <w:lang w:val="es-VE"/>
-        </w:rPr>
-        <w:t>En la actualidad, el mundo está caracterizado por el uso de tecnologías digitales; sin embargo, no todas las instituciones han adaptado sus procesos a estos avances. Al respecto, Cantillo L. y otros (ob. cit), refieren que “muchas plataformas automatizadas permiten enviar informes de asistencia a padres o representantes mediante mensajes de texto o aplicaciones, facilitando el control y la intervención oportuna si un estudiante falta a clase”.</w:t>
+        <w:t xml:space="preserve">Los actuales procesos manuales o </w:t>
+      </w:r>
+      <w:proofErr w:type="spellStart"/>
+      <w:r>
+        <w:rPr>
+          <w:b w:val="0"/>
+          <w:lang w:val="es-VE"/>
+        </w:rPr>
+        <w:t>semiautomatizados</w:t>
+      </w:r>
+      <w:proofErr w:type="spellEnd"/>
+      <w:r>
+        <w:rPr>
+          <w:b w:val="0"/>
+          <w:lang w:val="es-VE"/>
+        </w:rPr>
+        <w:t xml:space="preserve"> generan una carga de trabajo innecesaria en el personal administrativo y docente, retrasan la toma de decisiones oportunas y limitan la capacidad de generar estadísticas y reportes en tiempo real. La eficiencia operativa es uno de los factores determinantes en la gestión y control de asistencia, ya que postula que la optimización de los flujos de trabajo mediante la tecnología incrementa la productividad y reduce los costos indirectos.</w:t>
+      </w:r>
+    </w:p>
+    <w:p>
+      <w:pPr>
+        <w:pStyle w:val="Ttulo2"/>
+        <w:spacing w:line="360" w:lineRule="auto"/>
+        <w:rPr>
+          <w:b w:val="0"/>
+          <w:lang w:val="es-VE"/>
+        </w:rPr>
+      </w:pPr>
+    </w:p>
+    <w:p>
+      <w:pPr>
+        <w:pStyle w:val="Ttulo2"/>
+        <w:spacing w:line="360" w:lineRule="auto"/>
+        <w:rPr>
+          <w:b w:val="0"/>
+          <w:lang w:val="es-VE"/>
+        </w:rPr>
+      </w:pPr>
+      <w:r>
+        <w:rPr>
+          <w:b w:val="0"/>
+          <w:lang w:val="es-VE"/>
+        </w:rPr>
+        <w:t xml:space="preserve">En la actualidad, el mundo está caracterizado por el uso de tecnologías digitales; sin embargo, no todas las instituciones han adaptado sus procesos a estos avances. Al respecto, Cantillo L. y otros (ob. </w:t>
+      </w:r>
+      <w:proofErr w:type="spellStart"/>
+      <w:r>
+        <w:rPr>
+          <w:b w:val="0"/>
+          <w:lang w:val="es-VE"/>
+        </w:rPr>
+        <w:t>cit</w:t>
+      </w:r>
+      <w:proofErr w:type="spellEnd"/>
+      <w:r>
+        <w:rPr>
+          <w:b w:val="0"/>
+          <w:lang w:val="es-VE"/>
+        </w:rPr>
+        <w:t>), refieren que “muchas plataformas automatizadas permiten enviar informes de asistencia a padres o representantes mediante mensajes de texto o aplicaciones, facilitando el control y la intervención oportuna si un estudiante falta a clase”.</w:t>
       </w:r>
     </w:p>
     <w:p>
@@ -3216,8 +3394,6 @@
           <w:lang w:val="es-VE"/>
         </w:rPr>
       </w:pPr>
-      <w:bookmarkStart w:id="3" w:name="_GoBack"/>
-      <w:bookmarkEnd w:id="3"/>
     </w:p>
     <w:p>
       <w:pPr>
@@ -3502,7 +3678,21 @@
         <w:rPr>
           <w:b w:val="0"/>
         </w:rPr>
-        <w:t xml:space="preserve">Seguidamente, Izarra, K. (2024) realizó un aplicativo web para mejorar el control de asistencias de los estudiantes de la Institución Educativa César Vallejo de Chacapampa (Perú). El objetivo de la investigación se orientó a determinar de qué manera influye la implementación de un aplicativo web </w:t>
+        <w:t xml:space="preserve">Seguidamente, Izarra, K. (2024) realizó un aplicativo web para mejorar el control de asistencias de los estudiantes de la Institución Educativa César Vallejo de </w:t>
+      </w:r>
+      <w:proofErr w:type="spellStart"/>
+      <w:r>
+        <w:rPr>
+          <w:b w:val="0"/>
+        </w:rPr>
+        <w:t>Chacapampa</w:t>
+      </w:r>
+      <w:proofErr w:type="spellEnd"/>
+      <w:r>
+        <w:rPr>
+          <w:b w:val="0"/>
+        </w:rPr>
+        <w:t xml:space="preserve"> (Perú). El objetivo de la investigación se orientó a determinar de qué manera influye la implementación de un aplicativo web </w:t>
       </w:r>
       <w:r>
         <w:rPr>
@@ -3581,7 +3771,21 @@
         <w:rPr>
           <w:b w:val="0"/>
         </w:rPr>
-        <w:t>En al ámbito nacional, Ojeda, A. (2024) desarrolló un estudio titulado “Sistema de Información Automatizado de Control de Calificaciones de los Estudiantes Gestión del Centro de Capacitación de Jóvenes y Adultos Arturo Sarco Villena” en Turmero, Estado Aragua. El objetivo de la investigación fue desarrollar un sistema de información automatizado de control de calificaciones.</w:t>
+        <w:t xml:space="preserve">En al ámbito nacional, Ojeda, A. (2024) desarrolló un estudio titulado “Sistema de Información Automatizado de Control de Calificaciones de los Estudiantes Gestión del Centro de Capacitación de Jóvenes y Adultos Arturo </w:t>
+      </w:r>
+      <w:proofErr w:type="spellStart"/>
+      <w:r>
+        <w:rPr>
+          <w:b w:val="0"/>
+        </w:rPr>
+        <w:t>Sarco</w:t>
+      </w:r>
+      <w:proofErr w:type="spellEnd"/>
+      <w:r>
+        <w:rPr>
+          <w:b w:val="0"/>
+        </w:rPr>
+        <w:t xml:space="preserve"> Villena” en Turmero, Estado Aragua. El objetivo de la investigación fue desarrollar un sistema de información automatizado de control de calificaciones.</w:t>
       </w:r>
     </w:p>
     <w:p>
@@ -3708,7 +3912,21 @@
         <w:rPr>
           <w:b w:val="0"/>
         </w:rPr>
-        <w:t>El aporte que brinda a esta investigación se fundamenta en que sirve como un modelo base del flujo de datos. La aplicación desarrollada en el Zulia tuvo que interactuar con bases de datos de estudiantes y horarios, funciones exactas que la API de la nueva plataforma deberá emular mediante la creación de sus puntos finales (endpoints). Adicionalmente, este antecedente deja abierto el camino para que la presente propuesta innove incorporando Inteligencia Artificial, un elemento ausente en los estudios previos.</w:t>
+        <w:t>El aporte que brinda a esta investigación se fundamenta en que sirve como un modelo base del flujo de datos. La aplicación desarrollada en el Zulia tuvo que interactuar con bases de datos de estudiantes y horarios, funciones exactas que la API de la nueva plataforma deberá emular mediante la creación de sus puntos finales (</w:t>
+      </w:r>
+      <w:proofErr w:type="spellStart"/>
+      <w:r>
+        <w:rPr>
+          <w:b w:val="0"/>
+        </w:rPr>
+        <w:t>endpoints</w:t>
+      </w:r>
+      <w:proofErr w:type="spellEnd"/>
+      <w:r>
+        <w:rPr>
+          <w:b w:val="0"/>
+        </w:rPr>
+        <w:t>). Adicionalmente, este antecedente deja abierto el camino para que la presente propuesta innove incorporando Inteligencia Artificial, un elemento ausente en los estudios previos.</w:t>
       </w:r>
     </w:p>
     <w:p>
@@ -3805,7 +4023,23 @@
           <w:b w:val="0"/>
           <w:lang w:val="es-VE"/>
         </w:rPr>
-        <w:t>En el ámbito de la informática educativa, una plataforma web de gestión se define como un ecosistema digital centralizado y alojado en internet, diseñado específicamente para planificar, automatizar y monitorear los procesos administrativos y académicos de una institución. Estas herramientas actúan como el espacio de interacción visual (interfaz de usuario o frontend) donde el personal directivo y docente ingresa, gestiona y consulta la información escolar diaria de manera intuitiva.</w:t>
+        <w:t xml:space="preserve">En el ámbito de la informática educativa, una plataforma web de gestión se define como un ecosistema digital centralizado y alojado en internet, diseñado específicamente para planificar, automatizar y monitorear los procesos administrativos y académicos de una institución. Estas herramientas actúan como el espacio de interacción visual (interfaz de usuario o </w:t>
+      </w:r>
+      <w:proofErr w:type="spellStart"/>
+      <w:r>
+        <w:rPr>
+          <w:b w:val="0"/>
+          <w:lang w:val="es-VE"/>
+        </w:rPr>
+        <w:t>frontend</w:t>
+      </w:r>
+      <w:proofErr w:type="spellEnd"/>
+      <w:r>
+        <w:rPr>
+          <w:b w:val="0"/>
+          <w:lang w:val="es-VE"/>
+        </w:rPr>
+        <w:t>) donde el personal directivo y docente ingresa, gestiona y consulta la información escolar diaria de manera intuitiva.</w:t>
       </w:r>
     </w:p>
     <w:p>
@@ -3951,7 +4185,55 @@
           <w:b w:val="0"/>
           <w:lang w:val="es-VE"/>
         </w:rPr>
-        <w:t xml:space="preserve">Una Interfaz de Programación de Aplicaciones, conocida comúnmente por sus siglas en inglés API (Application Programming Interface), es un conjunto de reglas o protocolos que permiten que distintas aplicaciones de software se comuniquen entre sí para intercambiar datos, características y funcionalidades.Al respecto, Reyes y González (2022) definen la API web como "un conjunto de reglas que posibilita el enlace de dos programas de software para que logren comunicarse entre sí </w:t>
+        <w:t>Una Interfaz de Programación de Aplicaciones, conocida comúnmente por sus siglas en inglés API (</w:t>
+      </w:r>
+      <w:proofErr w:type="spellStart"/>
+      <w:r>
+        <w:rPr>
+          <w:b w:val="0"/>
+          <w:lang w:val="es-VE"/>
+        </w:rPr>
+        <w:t>Application</w:t>
+      </w:r>
+      <w:proofErr w:type="spellEnd"/>
+      <w:r>
+        <w:rPr>
+          <w:b w:val="0"/>
+          <w:lang w:val="es-VE"/>
+        </w:rPr>
+        <w:t xml:space="preserve"> </w:t>
+      </w:r>
+      <w:proofErr w:type="spellStart"/>
+      <w:r>
+        <w:rPr>
+          <w:b w:val="0"/>
+          <w:lang w:val="es-VE"/>
+        </w:rPr>
+        <w:t>Programming</w:t>
+      </w:r>
+      <w:proofErr w:type="spellEnd"/>
+      <w:r>
+        <w:rPr>
+          <w:b w:val="0"/>
+          <w:lang w:val="es-VE"/>
+        </w:rPr>
+        <w:t xml:space="preserve"> Interface), es un conjunto de reglas o protocolos que permiten que distintas aplicaciones de software se comuniquen entre sí para intercambiar datos, características y </w:t>
+      </w:r>
+      <w:proofErr w:type="spellStart"/>
+      <w:r>
+        <w:rPr>
+          <w:b w:val="0"/>
+          <w:lang w:val="es-VE"/>
+        </w:rPr>
+        <w:t>funcionalidades.Al</w:t>
+      </w:r>
+      <w:proofErr w:type="spellEnd"/>
+      <w:r>
+        <w:rPr>
+          <w:b w:val="0"/>
+          <w:lang w:val="es-VE"/>
+        </w:rPr>
+        <w:t xml:space="preserve"> respecto, Reyes y González (2022) definen la API web como "un conjunto de reglas que posibilita el enlace de dos programas de software para que logren comunicarse entre sí </w:t>
       </w:r>
       <w:r>
         <w:rPr>
@@ -3973,7 +4255,23 @@
           <w:b w:val="0"/>
           <w:lang w:val="es-VE"/>
         </w:rPr>
-        <w:t>En el contexto de la plataforma de automatización planteada para la institución, la API representará la arquitectura lógica central (backend). Su función será recibir las peticiones desde la plataforma web, procesar la información de la asistencia estudiantil en la base de datos y servir como puente de conexión para integrar de manera armónica los algoritmos de Inteligencia Artificial.</w:t>
+        <w:t>En el contexto de la plataforma de automatización planteada para la institución, la API representará la arquitectura lógica central (</w:t>
+      </w:r>
+      <w:proofErr w:type="spellStart"/>
+      <w:r>
+        <w:rPr>
+          <w:b w:val="0"/>
+          <w:lang w:val="es-VE"/>
+        </w:rPr>
+        <w:t>backend</w:t>
+      </w:r>
+      <w:proofErr w:type="spellEnd"/>
+      <w:r>
+        <w:rPr>
+          <w:b w:val="0"/>
+          <w:lang w:val="es-VE"/>
+        </w:rPr>
+        <w:t>). Su función será recibir las peticiones desde la plataforma web, procesar la información de la asistencia estudiantil en la base de datos y servir como puente de conexión para integrar de manera armónica los algoritmos de Inteligencia Artificial.</w:t>
       </w:r>
     </w:p>
     <w:p>
@@ -4048,7 +4346,49 @@
         <w:rPr>
           <w:b w:val="0"/>
         </w:rPr>
-        <w:t>En el ecosistema del desarrollo de software, existen diferentes enfoques para estructurar la comunicación entre sistemas. Al respecto, Lauret (2019) establece que las API REST (Representational State Transfer) siguen un estilo arquitectónico que usa protocolos web estándar como HTTP (Protocolo de Transferencia de Hipertexto). Este es un protocolo esencial para la correcta transferencia de datos en la red y es ampliamente utilizado para la creación de sitios web, permitiendo el intercambio de datos en formatos ligeros como JSON o XML. La función de dichos formatos es transportar de manera estructurada los datos usados para la comunicación entre sistemas o aplicaciones.</w:t>
+        <w:t xml:space="preserve">En el ecosistema del desarrollo de software, existen diferentes enfoques para estructurar la comunicación entre sistemas. Al respecto, </w:t>
+      </w:r>
+      <w:proofErr w:type="spellStart"/>
+      <w:r>
+        <w:rPr>
+          <w:b w:val="0"/>
+        </w:rPr>
+        <w:t>Lauret</w:t>
+      </w:r>
+      <w:proofErr w:type="spellEnd"/>
+      <w:r>
+        <w:rPr>
+          <w:b w:val="0"/>
+        </w:rPr>
+        <w:t xml:space="preserve"> (2019) establece que las API REST (</w:t>
+      </w:r>
+      <w:proofErr w:type="spellStart"/>
+      <w:r>
+        <w:rPr>
+          <w:b w:val="0"/>
+        </w:rPr>
+        <w:t>Representational</w:t>
+      </w:r>
+      <w:proofErr w:type="spellEnd"/>
+      <w:r>
+        <w:rPr>
+          <w:b w:val="0"/>
+        </w:rPr>
+        <w:t xml:space="preserve"> </w:t>
+      </w:r>
+      <w:proofErr w:type="spellStart"/>
+      <w:r>
+        <w:rPr>
+          <w:b w:val="0"/>
+        </w:rPr>
+        <w:t>State</w:t>
+      </w:r>
+      <w:proofErr w:type="spellEnd"/>
+      <w:r>
+        <w:rPr>
+          <w:b w:val="0"/>
+        </w:rPr>
+        <w:t xml:space="preserve"> Transfer) siguen un estilo arquitectónico que usa protocolos web estándar como HTTP (Protocolo de Transferencia de Hipertexto). Este es un protocolo esencial para la correcta transferencia de datos en la red y es ampliamente utilizado para la creación de sitios web, permitiendo el intercambio de datos en formatos ligeros como JSON o XML. La función de dichos formatos es transportar de manera estructurada los datos usados para la comunicación entre sistemas o aplicaciones.</w:t>
       </w:r>
     </w:p>
     <w:p>
@@ -4092,12 +4432,14 @@
           <w:b w:val="0"/>
         </w:rPr>
       </w:pPr>
+      <w:proofErr w:type="spellStart"/>
       <w:r>
         <w:rPr>
           <w:b w:val="0"/>
         </w:rPr>
         <w:t>GraphQL</w:t>
       </w:r>
+      <w:proofErr w:type="spellEnd"/>
       <w:r>
         <w:t>:</w:t>
       </w:r>
@@ -4126,7 +4468,35 @@
         <w:rPr>
           <w:b w:val="0"/>
         </w:rPr>
-        <w:t>SOAP (Simple Object Access Protocol): Es un protocolo robusto que se basa estrictamente en el lenguaje XML para hacer posible el intercambio de información de manera estructurada y con altos niveles de seguridad.</w:t>
+        <w:t xml:space="preserve">SOAP (Simple </w:t>
+      </w:r>
+      <w:proofErr w:type="spellStart"/>
+      <w:r>
+        <w:rPr>
+          <w:b w:val="0"/>
+        </w:rPr>
+        <w:t>Object</w:t>
+      </w:r>
+      <w:proofErr w:type="spellEnd"/>
+      <w:r>
+        <w:rPr>
+          <w:b w:val="0"/>
+        </w:rPr>
+        <w:t xml:space="preserve"> Access </w:t>
+      </w:r>
+      <w:proofErr w:type="spellStart"/>
+      <w:r>
+        <w:rPr>
+          <w:b w:val="0"/>
+        </w:rPr>
+        <w:t>Protocol</w:t>
+      </w:r>
+      <w:proofErr w:type="spellEnd"/>
+      <w:r>
+        <w:rPr>
+          <w:b w:val="0"/>
+        </w:rPr>
+        <w:t>): Es un protocolo robusto que se basa estrictamente en el lenguaje XML para hacer posible el intercambio de información de manera estructurada y con altos niveles de seguridad.</w:t>
       </w:r>
     </w:p>
     <w:p>
@@ -4346,7 +4716,23 @@
           <w:b w:val="0"/>
           <w:lang w:val="es-VE"/>
         </w:rPr>
-        <w:t xml:space="preserve">Compartir datos: Hacen posible el acceso seguro y controlado a grandes conjuntos de información externa, como bases de datos de noticias (por ejemplo, The New York Times) o repositorios de acceso público </w:t>
+        <w:t xml:space="preserve">Compartir datos: Hacen posible el acceso seguro y controlado a grandes conjuntos de información externa, como bases de datos de noticias (por ejemplo, </w:t>
+      </w:r>
+      <w:proofErr w:type="spellStart"/>
+      <w:r>
+        <w:rPr>
+          <w:b w:val="0"/>
+          <w:lang w:val="es-VE"/>
+        </w:rPr>
+        <w:t>The</w:t>
+      </w:r>
+      <w:proofErr w:type="spellEnd"/>
+      <w:r>
+        <w:rPr>
+          <w:b w:val="0"/>
+          <w:lang w:val="es-VE"/>
+        </w:rPr>
+        <w:t xml:space="preserve"> New York Times) o repositorios de acceso público </w:t>
       </w:r>
     </w:p>
     <w:p>
@@ -4822,26 +5208,67 @@
           <w:spacing w:val="-2"/>
         </w:rPr>
       </w:pPr>
-      <w:r>
-        <w:rPr>
-          <w:b w:val="0"/>
-          <w:spacing w:val="-2"/>
-        </w:rPr>
-        <w:t>Yusuf y Alabi (2019) definen el control de asistencia como un sistema utilizado para registrar y monitorear la entrada, salida y permanencia de los estudiantes a sus diversas clases. Este mecanismo permite llevar un registro preciso de las horas de clase, ausencias, retrasos y descansos. Exponen, asimismo, que las instituciones educativas enfrentan diversos desafíos, entre los que se incluyen la falta de puntualidad, las altas tasas de ausentismo no autorizado y la dificultad para gestionar grandes volúmenes de datos de manera precisa.</w:t>
-      </w:r>
-      <w:r>
-        <w:rPr>
-          <w:b w:val="0"/>
-          <w:spacing w:val="-2"/>
-        </w:rPr>
-        <w:t xml:space="preserve"> </w:t>
-      </w:r>
-      <w:r>
-        <w:rPr>
-          <w:b w:val="0"/>
-          <w:spacing w:val="-2"/>
-        </w:rPr>
-        <w:t xml:space="preserve">Por su parte, Zheng (2024) establece que un análisis de la viabilidad en la adopción de estas tecnologías debe considerar varios desafíos, como la resistencia al cambio y la necesidad de formación técnica tanto para los administradores como para los estudiantes. </w:t>
+      <w:proofErr w:type="spellStart"/>
+      <w:r>
+        <w:rPr>
+          <w:b w:val="0"/>
+          <w:spacing w:val="-2"/>
+        </w:rPr>
+        <w:t>Yusuf</w:t>
+      </w:r>
+      <w:proofErr w:type="spellEnd"/>
+      <w:r>
+        <w:rPr>
+          <w:b w:val="0"/>
+          <w:spacing w:val="-2"/>
+        </w:rPr>
+        <w:t xml:space="preserve"> y </w:t>
+      </w:r>
+      <w:proofErr w:type="spellStart"/>
+      <w:r>
+        <w:rPr>
+          <w:b w:val="0"/>
+          <w:spacing w:val="-2"/>
+        </w:rPr>
+        <w:t>Alabi</w:t>
+      </w:r>
+      <w:proofErr w:type="spellEnd"/>
+      <w:r>
+        <w:rPr>
+          <w:b w:val="0"/>
+          <w:spacing w:val="-2"/>
+        </w:rPr>
+        <w:t xml:space="preserve"> (2019) definen el control de asistencia como un sistema utilizado para registrar y monitorear la entrada, salida y permanencia de los estudiantes a sus diversas clases. Este mecanismo permite llevar un registro preciso de las horas de clase, ausencias, retrasos y descansos. Exponen, asimismo, que las instituciones educativas enfrentan diversos desafíos, entre los que se incluyen la falta de puntualidad, las altas tasas de ausentismo no autorizado y la dificultad para gestionar grandes volúmenes de datos de manera precisa.</w:t>
+      </w:r>
+      <w:r>
+        <w:rPr>
+          <w:b w:val="0"/>
+          <w:spacing w:val="-2"/>
+        </w:rPr>
+        <w:t xml:space="preserve"> </w:t>
+      </w:r>
+      <w:r>
+        <w:rPr>
+          <w:b w:val="0"/>
+          <w:spacing w:val="-2"/>
+        </w:rPr>
+        <w:t xml:space="preserve">Por su parte, </w:t>
+      </w:r>
+      <w:proofErr w:type="spellStart"/>
+      <w:r>
+        <w:rPr>
+          <w:b w:val="0"/>
+          <w:spacing w:val="-2"/>
+        </w:rPr>
+        <w:t>Zheng</w:t>
+      </w:r>
+      <w:proofErr w:type="spellEnd"/>
+      <w:r>
+        <w:rPr>
+          <w:b w:val="0"/>
+          <w:spacing w:val="-2"/>
+        </w:rPr>
+        <w:t xml:space="preserve"> (2024) establece que un análisis de la viabilidad en la adopción de estas tecnologías debe considerar varios desafíos, como la resistencia al cambio y la necesidad de formación técnica tanto para los administradores como para los estudiantes. </w:t>
       </w:r>
     </w:p>
     <w:p>
@@ -4889,7 +5316,23 @@
           <w:b w:val="0"/>
           <w:spacing w:val="-2"/>
         </w:rPr>
-        <w:t>A nivel pedagógico, la asistencia constante permite que los estudiantes desarrollen en clase los conocimientos, habilidades y actitudes que deben aprender durante la educación escolar. Además, permite a los alumnos construir relaciones de amistad con sus compañeros y conocer mejor a sus profesores. Asistir regularmente promueve el desarrollo de la responsabilidad, la perseverancia y otros hábitos que facilitarán la vida futura de los jóvenes, aumentando su capacidad de resiliencia y previniendo factores como la depresión. De hecho, pruebas estandarizadas internacionales, como el Simce y la PSU, muestran que los resultados académicos se relacionan directamente con el porcentaje de asistencia.</w:t>
+        <w:t xml:space="preserve">A nivel pedagógico, la asistencia constante permite que los estudiantes desarrollen en clase los conocimientos, habilidades y actitudes que deben aprender durante la educación escolar. Además, permite a los alumnos construir relaciones de amistad con sus compañeros y conocer mejor a sus profesores. Asistir regularmente promueve el desarrollo de la responsabilidad, la perseverancia y otros hábitos que facilitarán la vida futura de los jóvenes, aumentando su capacidad de resiliencia y previniendo factores como la depresión. De hecho, pruebas estandarizadas internacionales, como el </w:t>
+      </w:r>
+      <w:proofErr w:type="spellStart"/>
+      <w:r>
+        <w:rPr>
+          <w:b w:val="0"/>
+          <w:spacing w:val="-2"/>
+        </w:rPr>
+        <w:t>Simce</w:t>
+      </w:r>
+      <w:proofErr w:type="spellEnd"/>
+      <w:r>
+        <w:rPr>
+          <w:b w:val="0"/>
+          <w:spacing w:val="-2"/>
+        </w:rPr>
+        <w:t xml:space="preserve"> y la PSU, muestran que los resultados académicos se relacionan directamente con el porcentaje de asistencia.</w:t>
       </w:r>
     </w:p>
     <w:p>
@@ -4953,7 +5396,23 @@
           <w:b w:val="0"/>
           <w:bCs w:val="0"/>
         </w:rPr>
-        <w:t>La gestión administrativa escolar enfocada en el control de asistencia estudiantil es un proceso fundamental que busca registrar, monitorear, analizar y reportar la presencia o ausencia de los alumnos. Este control es crucial para el cumplimiento de las normativas educativas, el seguimiento del rendimiento académico y la seguridad de la población estudiantil. En este contexto, teóricos como Riffo San Martín (2019) destacan la necesidad de que la administración educativa modernice sus estrategias organizacionales, asegurando que el flujo de información sea continuo, verificable y útil para la institución.</w:t>
+        <w:t xml:space="preserve">La gestión administrativa escolar enfocada en el control de asistencia estudiantil es un proceso fundamental que busca registrar, monitorear, analizar y reportar la presencia o ausencia de los alumnos. Este control es crucial para el cumplimiento de las normativas educativas, el seguimiento del rendimiento académico y la seguridad de la población estudiantil. En este contexto, teóricos como </w:t>
+      </w:r>
+      <w:proofErr w:type="spellStart"/>
+      <w:r>
+        <w:rPr>
+          <w:b w:val="0"/>
+          <w:bCs w:val="0"/>
+        </w:rPr>
+        <w:t>Riffo</w:t>
+      </w:r>
+      <w:proofErr w:type="spellEnd"/>
+      <w:r>
+        <w:rPr>
+          <w:b w:val="0"/>
+          <w:bCs w:val="0"/>
+        </w:rPr>
+        <w:t xml:space="preserve"> San Martín (2019) destacan la necesidad de que la administración educativa modernice sus estrategias organizacionales, asegurando que el flujo de información sea continuo, verificable y útil para la institución.</w:t>
       </w:r>
     </w:p>
     <w:p>
@@ -6394,7 +6853,23 @@
           <w:b/>
           <w:lang w:val="es-VE"/>
         </w:rPr>
-        <w:t xml:space="preserve">Ley de Infogobierno (2013) </w:t>
+        <w:t xml:space="preserve">Ley de </w:t>
+      </w:r>
+      <w:proofErr w:type="spellStart"/>
+      <w:r>
+        <w:rPr>
+          <w:b/>
+          <w:lang w:val="es-VE"/>
+        </w:rPr>
+        <w:t>Infogobierno</w:t>
+      </w:r>
+      <w:proofErr w:type="spellEnd"/>
+      <w:r>
+        <w:rPr>
+          <w:b/>
+          <w:lang w:val="es-VE"/>
+        </w:rPr>
+        <w:t xml:space="preserve"> (2013) </w:t>
       </w:r>
     </w:p>
     <w:p>
@@ -6426,7 +6901,21 @@
         <w:rPr>
           <w:lang w:val="es-VE"/>
         </w:rPr>
-        <w:t xml:space="preserve"> Establece las normas que rigen el uso de las tecnologías de información en el sector público y privado para mejorar la gestión y los servicios. Esta ley sustenta la transición del registro manual (listas y libros físicos) al digital, validando la legalidad de los documentos y reportes generados electrónicamente por la plataforma de automatización.</w:t>
+        <w:t xml:space="preserve"> Establece las normas que rigen el uso de las tecnologías de información en el sector público y privado para mejorar la gestión y los servicios. Esta ley sustenta la transición del registro manual (listas y libros físicos) </w:t>
+      </w:r>
+      <w:proofErr w:type="gramStart"/>
+      <w:r>
+        <w:rPr>
+          <w:lang w:val="es-VE"/>
+        </w:rPr>
+        <w:t>al digital</w:t>
+      </w:r>
+      <w:proofErr w:type="gramEnd"/>
+      <w:r>
+        <w:rPr>
+          <w:lang w:val="es-VE"/>
+        </w:rPr>
+        <w:t>, validando la legalidad de los documentos y reportes generados electrónicamente por la plataforma de automatización.</w:t>
       </w:r>
     </w:p>
     <w:p>
@@ -7280,9 +7769,11 @@
         </w:rPr>
         <w:t xml:space="preserve"> </w:t>
       </w:r>
+      <w:proofErr w:type="spellStart"/>
       <w:r>
         <w:t>Neill</w:t>
       </w:r>
+      <w:proofErr w:type="spellEnd"/>
       <w:r>
         <w:rPr>
           <w:spacing w:val="-15"/>
@@ -7714,7 +8205,35 @@
         <w:rPr>
           <w:b w:val="0"/>
         </w:rPr>
-        <w:t>Esta fase constituye la etapa medular del proyecto, donde se define la arquitectura de software bajo un enfoque de ingeniería moderna. El diseño se orienta a la creación de una plataforma escalable, robusta y mantenible, utilizando un stack tecnológico de vanguardia que garantiza la eficiencia en el manejo de datos escolares.</w:t>
+        <w:t xml:space="preserve">Esta fase constituye la etapa medular del proyecto, donde se define la arquitectura de software bajo un enfoque de ingeniería moderna. El diseño se orienta a la creación de una plataforma escalable, robusta y </w:t>
+      </w:r>
+      <w:proofErr w:type="spellStart"/>
+      <w:r>
+        <w:rPr>
+          <w:b w:val="0"/>
+        </w:rPr>
+        <w:t>mantenible</w:t>
+      </w:r>
+      <w:proofErr w:type="spellEnd"/>
+      <w:r>
+        <w:rPr>
+          <w:b w:val="0"/>
+        </w:rPr>
+        <w:t xml:space="preserve">, utilizando un </w:t>
+      </w:r>
+      <w:proofErr w:type="spellStart"/>
+      <w:r>
+        <w:rPr>
+          <w:b w:val="0"/>
+        </w:rPr>
+        <w:t>stack</w:t>
+      </w:r>
+      <w:proofErr w:type="spellEnd"/>
+      <w:r>
+        <w:rPr>
+          <w:b w:val="0"/>
+        </w:rPr>
+        <w:t xml:space="preserve"> tecnológico de vanguardia que garantiza la eficiencia en el manejo de datos escolares.</w:t>
       </w:r>
     </w:p>
     <w:p>
@@ -7723,7 +8242,15 @@
         <w:spacing w:before="162"/>
       </w:pPr>
       <w:r>
-        <w:t>1. Arquitectura de Front-end (Interfaz de Usuario de Alto Rendimiento):</w:t>
+        <w:t>1. Arquitectura de Front-</w:t>
+      </w:r>
+      <w:proofErr w:type="spellStart"/>
+      <w:r>
+        <w:t>end</w:t>
+      </w:r>
+      <w:proofErr w:type="spellEnd"/>
+      <w:r>
+        <w:t xml:space="preserve"> (Interfaz de Usuario de Alto Rendimiento):</w:t>
       </w:r>
     </w:p>
     <w:p>
@@ -7747,7 +8274,49 @@
         <w:rPr>
           <w:b w:val="0"/>
         </w:rPr>
-        <w:t>El desarrollo de la interfaz se fundamenta en el uso de React o Next.js, permitiendo una navegación fluida sin recargas de página innecesarias. Se opta por TypeScript como lenguaje principal para implementar un tipado estático, lo que reduce drásticamente los errores en tiempo de ejecución y facilita el mantenimiento del código a largo plazo.</w:t>
+        <w:t xml:space="preserve">El desarrollo de la interfaz se fundamenta en el uso de </w:t>
+      </w:r>
+      <w:proofErr w:type="spellStart"/>
+      <w:r>
+        <w:rPr>
+          <w:b w:val="0"/>
+        </w:rPr>
+        <w:t>React</w:t>
+      </w:r>
+      <w:proofErr w:type="spellEnd"/>
+      <w:r>
+        <w:rPr>
+          <w:b w:val="0"/>
+        </w:rPr>
+        <w:t xml:space="preserve"> o Next.js, permitiendo una navegación fluida sin recargas de página innecesarias. Se opta por </w:t>
+      </w:r>
+      <w:proofErr w:type="spellStart"/>
+      <w:r>
+        <w:rPr>
+          <w:b w:val="0"/>
+        </w:rPr>
+        <w:t>TypeScript</w:t>
+      </w:r>
+      <w:proofErr w:type="spellEnd"/>
+      <w:r>
+        <w:rPr>
+          <w:b w:val="0"/>
+        </w:rPr>
+        <w:t xml:space="preserve"> como lenguaje principal para implementar un </w:t>
+      </w:r>
+      <w:proofErr w:type="spellStart"/>
+      <w:r>
+        <w:rPr>
+          <w:b w:val="0"/>
+        </w:rPr>
+        <w:t>tipado</w:t>
+      </w:r>
+      <w:proofErr w:type="spellEnd"/>
+      <w:r>
+        <w:rPr>
+          <w:b w:val="0"/>
+        </w:rPr>
+        <w:t xml:space="preserve"> estático, lo que reduce drásticamente los errores en tiempo de ejecución y facilita el mantenimiento del código a largo plazo.</w:t>
       </w:r>
       <w:r>
         <w:rPr>
@@ -7813,7 +8382,15 @@
         <w:spacing w:before="162"/>
       </w:pPr>
       <w:r>
-        <w:t>2. Diseño de la API RESTful (Cerebro Lógico y Comunicación):</w:t>
+        <w:t xml:space="preserve">2. Diseño de la API </w:t>
+      </w:r>
+      <w:proofErr w:type="spellStart"/>
+      <w:r>
+        <w:t>RESTful</w:t>
+      </w:r>
+      <w:proofErr w:type="spellEnd"/>
+      <w:r>
+        <w:t xml:space="preserve"> (Cerebro Lógico y Comunicación):</w:t>
       </w:r>
     </w:p>
     <w:p>
@@ -7861,7 +8438,21 @@
         <w:rPr>
           <w:b w:val="0"/>
         </w:rPr>
-        <w:t>tegrarán protocolos de seguridad (como JWT - JSON Web Tokens) para garantizar que solo los usuarios autorizados (Directivos y Docentes registrados) puedan acceder a la información sensible de los menores, cumpliendo estrictamente con la LOPNA.</w:t>
+        <w:t xml:space="preserve">tegrarán protocolos de seguridad (como JWT - JSON Web </w:t>
+      </w:r>
+      <w:proofErr w:type="spellStart"/>
+      <w:r>
+        <w:rPr>
+          <w:b w:val="0"/>
+        </w:rPr>
+        <w:t>Tokens</w:t>
+      </w:r>
+      <w:proofErr w:type="spellEnd"/>
+      <w:r>
+        <w:rPr>
+          <w:b w:val="0"/>
+        </w:rPr>
+        <w:t>) para garantizar que solo los usuarios autorizados (Directivos y Docentes registrados) puedan acceder a la información sensible de los menores, cumpliendo estrictamente con la LOPNA.</w:t>
       </w:r>
       <w:r>
         <w:rPr>
@@ -7933,7 +8524,21 @@
         <w:rPr>
           <w:b w:val="0"/>
         </w:rPr>
-        <w:t>Se diseñan algoritmos que, basándose en el histórico de asistencia, puedan predecir qué estudiantes requieren una intervención administrativa o pedagógica inmediata, enviando alertas automáticas a través del dashboard de la plataforma.</w:t>
+        <w:t xml:space="preserve">Se diseñan algoritmos que, basándose en el histórico de asistencia, puedan predecir qué estudiantes requieren una intervención administrativa o pedagógica inmediata, enviando alertas automáticas a través del </w:t>
+      </w:r>
+      <w:proofErr w:type="spellStart"/>
+      <w:r>
+        <w:rPr>
+          <w:b w:val="0"/>
+        </w:rPr>
+        <w:t>dashboard</w:t>
+      </w:r>
+      <w:proofErr w:type="spellEnd"/>
+      <w:r>
+        <w:rPr>
+          <w:b w:val="0"/>
+        </w:rPr>
+        <w:t xml:space="preserve"> de la plataforma.</w:t>
       </w:r>
     </w:p>
     <w:p>
@@ -7966,7 +8571,35 @@
         <w:rPr>
           <w:b w:val="0"/>
         </w:rPr>
-        <w:t>Para soportar esta arquitectura, se diseñará una base de datos relacional (ej. PostgreSQL o MySQL) altamente normalizada. Se estructurarán tablas interconectadas para Estudiantes, Docentes, Secciones, Horarios y Registros Diarios, garantizando la integridad referencial. Esto asegura que cada dato de asistencia esté vinculado correctamente a un estudiante único y a una fecha específica sin duplicidades.</w:t>
+        <w:t xml:space="preserve">Para soportar esta arquitectura, se diseñará una base de datos relacional (ej. </w:t>
+      </w:r>
+      <w:proofErr w:type="spellStart"/>
+      <w:r>
+        <w:rPr>
+          <w:b w:val="0"/>
+        </w:rPr>
+        <w:t>PostgreSQL</w:t>
+      </w:r>
+      <w:proofErr w:type="spellEnd"/>
+      <w:r>
+        <w:rPr>
+          <w:b w:val="0"/>
+        </w:rPr>
+        <w:t xml:space="preserve"> o </w:t>
+      </w:r>
+      <w:proofErr w:type="spellStart"/>
+      <w:r>
+        <w:rPr>
+          <w:b w:val="0"/>
+        </w:rPr>
+        <w:t>MySQL</w:t>
+      </w:r>
+      <w:proofErr w:type="spellEnd"/>
+      <w:r>
+        <w:rPr>
+          <w:b w:val="0"/>
+        </w:rPr>
+        <w:t>) altamente normalizada. Se estructurarán tablas interconectadas para Estudiantes, Docentes, Secciones, Horarios y Registros Diarios, garantizando la integridad referencial. Esto asegura que cada dato de asistencia esté vinculado correctamente a un estudiante único y a una fecha específica sin duplicidades.</w:t>
       </w:r>
     </w:p>
     <w:p>
@@ -8074,7 +8707,23 @@
           <w:b w:val="0"/>
           <w:bCs w:val="0"/>
         </w:rPr>
-        <w:t>En esta etapa final, se procederá a verificar la funcionalidad, pertinencia técnica y consistencia metodológica de la plataforma de automatización. Dado que el proyecto integra tecnologías avanzadas como Next.js, TypeScript y módulos de Inteligencia Artificial, la validación se estructurará bajo dos enfoques complementarios:</w:t>
+        <w:t xml:space="preserve">En esta etapa final, se procederá a verificar la funcionalidad, pertinencia técnica y consistencia metodológica de la plataforma de automatización. Dado que el proyecto integra tecnologías avanzadas como Next.js, </w:t>
+      </w:r>
+      <w:proofErr w:type="spellStart"/>
+      <w:r>
+        <w:rPr>
+          <w:b w:val="0"/>
+          <w:bCs w:val="0"/>
+        </w:rPr>
+        <w:t>TypeScript</w:t>
+      </w:r>
+      <w:proofErr w:type="spellEnd"/>
+      <w:r>
+        <w:rPr>
+          <w:b w:val="0"/>
+          <w:bCs w:val="0"/>
+        </w:rPr>
+        <w:t xml:space="preserve"> y módulos de Inteligencia Artificial, la validación se estructurará bajo dos enfoques complementarios:</w:t>
       </w:r>
     </w:p>
     <w:p>
@@ -8116,7 +8765,71 @@
           <w:b w:val="0"/>
           <w:bCs w:val="0"/>
         </w:rPr>
-        <w:t>Antes de someter la propuesta al juicio externo, se realizarán pruebas de entorno para asegurar la integridad de la arquitectura. Esto incluye la verificación de los endpoints de la API para garantizar que el intercambio de datos en formato JSON sea correcto, y pruebas de tipado en el frontend con TypeScript para minimizar errores de lógica. Se validará que la comunicación entre la interfaz web y el motor de IA sea fluida, permitiendo que los reportes de asistencia se generen sin latencia.</w:t>
+        <w:t xml:space="preserve">Antes de someter la propuesta al juicio externo, se realizarán pruebas de entorno para asegurar la integridad de la arquitectura. Esto incluye la verificación de los </w:t>
+      </w:r>
+      <w:proofErr w:type="spellStart"/>
+      <w:r>
+        <w:rPr>
+          <w:b w:val="0"/>
+          <w:bCs w:val="0"/>
+        </w:rPr>
+        <w:t>endpoints</w:t>
+      </w:r>
+      <w:proofErr w:type="spellEnd"/>
+      <w:r>
+        <w:rPr>
+          <w:b w:val="0"/>
+          <w:bCs w:val="0"/>
+        </w:rPr>
+        <w:t xml:space="preserve"> de la API para garantizar que el intercambio de datos en formato JSON sea correcto, y pruebas de </w:t>
+      </w:r>
+      <w:proofErr w:type="spellStart"/>
+      <w:r>
+        <w:rPr>
+          <w:b w:val="0"/>
+          <w:bCs w:val="0"/>
+        </w:rPr>
+        <w:t>tipado</w:t>
+      </w:r>
+      <w:proofErr w:type="spellEnd"/>
+      <w:r>
+        <w:rPr>
+          <w:b w:val="0"/>
+          <w:bCs w:val="0"/>
+        </w:rPr>
+        <w:t xml:space="preserve"> en el </w:t>
+      </w:r>
+      <w:proofErr w:type="spellStart"/>
+      <w:r>
+        <w:rPr>
+          <w:b w:val="0"/>
+          <w:bCs w:val="0"/>
+        </w:rPr>
+        <w:t>frontend</w:t>
+      </w:r>
+      <w:proofErr w:type="spellEnd"/>
+      <w:r>
+        <w:rPr>
+          <w:b w:val="0"/>
+          <w:bCs w:val="0"/>
+        </w:rPr>
+        <w:t xml:space="preserve"> con </w:t>
+      </w:r>
+      <w:proofErr w:type="spellStart"/>
+      <w:r>
+        <w:rPr>
+          <w:b w:val="0"/>
+          <w:bCs w:val="0"/>
+        </w:rPr>
+        <w:t>TypeScript</w:t>
+      </w:r>
+      <w:proofErr w:type="spellEnd"/>
+      <w:r>
+        <w:rPr>
+          <w:b w:val="0"/>
+          <w:bCs w:val="0"/>
+        </w:rPr>
+        <w:t xml:space="preserve"> para minimizar errores de lógica. Se validará que la comunicación entre la interfaz web y el motor de IA sea fluida, permitiendo que los reportes de asistencia se generen sin latencia.</w:t>
       </w:r>
     </w:p>
     <w:p>
@@ -8240,7 +8953,23 @@
           <w:b w:val="0"/>
           <w:bCs w:val="0"/>
         </w:rPr>
-        <w:t xml:space="preserve"> Los expertos validarán si la estructura de la plataforma responde realmente a las necesidades administrativas del Colegio Andrés Bello y si cumple con los marcos legales (LOPNA e Infogobierno) analizados en el Momento II.</w:t>
+        <w:t xml:space="preserve"> Los expertos validarán si la estructura de la plataforma responde realmente a las necesidades administrativas del Colegio Andrés Bello y si cumple con los marcos legales (LOPNA e </w:t>
+      </w:r>
+      <w:proofErr w:type="spellStart"/>
+      <w:r>
+        <w:rPr>
+          <w:b w:val="0"/>
+          <w:bCs w:val="0"/>
+        </w:rPr>
+        <w:t>Infogobierno</w:t>
+      </w:r>
+      <w:proofErr w:type="spellEnd"/>
+      <w:r>
+        <w:rPr>
+          <w:b w:val="0"/>
+          <w:bCs w:val="0"/>
+        </w:rPr>
+        <w:t>) analizados en el Momento II.</w:t>
       </w:r>
     </w:p>
     <w:p>
@@ -8418,10 +9147,7 @@
         <w:t xml:space="preserve">La variable del presente estudio está representada por la necesidad de diagnosticar </w:t>
       </w:r>
       <w:r>
-        <w:t>la creación de una plataforma de automatización (Web, API e Inteligencia Artificial)</w:t>
-      </w:r>
-      <w:r>
-        <w:t xml:space="preserve"> </w:t>
+        <w:t xml:space="preserve">la creación de una plataforma de automatización (Web, API e Inteligencia Artificial) </w:t>
       </w:r>
       <w:r>
         <w:t xml:space="preserve">permita la gestión y el control de la asistencia estudiantil de bachillerato en el Colegio Andrés Bello, denominándose </w:t>
@@ -9164,23 +9890,95 @@
           <w:spacing w:val="-2"/>
           <w:lang w:val="es-VE"/>
         </w:rPr>
-        <w:t>Para Palella y Martins (2012), la confiabilidad de un instrumento de medición se define como "la ausencia de error aleatorio en un instrumento de recolección de datos" (p. 164). En otras palabras, representa el grado en que la aplicación repetida del cuestionario al mismo sujeto u objeto de estudio produce resultados consistentes y coherentes.</w:t>
-      </w:r>
-      <w:r>
-        <w:rPr>
-          <w:b w:val="0"/>
-          <w:spacing w:val="-2"/>
-          <w:lang w:val="es-VE"/>
-        </w:rPr>
-        <w:t xml:space="preserve"> </w:t>
-      </w:r>
-      <w:r>
-        <w:rPr>
-          <w:b w:val="0"/>
-          <w:spacing w:val="-2"/>
-          <w:lang w:val="es-VE"/>
-        </w:rPr>
-        <w:t>Dada la naturaleza del instrumento diseñado para esta investigación, el cual consiste en un cuestionario con ítems de respuesta múltiple estructurados bajo una escala de estimación tipo Likert, la confiabilidad se determinará estadísticamente a través del coeficiente de Alfa de Cronbach. Este método es el indicado para instrumentos con múltiples opciones de respuesta policotómicas.</w:t>
+        <w:t xml:space="preserve">Para </w:t>
+      </w:r>
+      <w:proofErr w:type="spellStart"/>
+      <w:r>
+        <w:rPr>
+          <w:b w:val="0"/>
+          <w:spacing w:val="-2"/>
+          <w:lang w:val="es-VE"/>
+        </w:rPr>
+        <w:t>Palella</w:t>
+      </w:r>
+      <w:proofErr w:type="spellEnd"/>
+      <w:r>
+        <w:rPr>
+          <w:b w:val="0"/>
+          <w:spacing w:val="-2"/>
+          <w:lang w:val="es-VE"/>
+        </w:rPr>
+        <w:t xml:space="preserve"> y </w:t>
+      </w:r>
+      <w:proofErr w:type="spellStart"/>
+      <w:r>
+        <w:rPr>
+          <w:b w:val="0"/>
+          <w:spacing w:val="-2"/>
+          <w:lang w:val="es-VE"/>
+        </w:rPr>
+        <w:t>Martins</w:t>
+      </w:r>
+      <w:proofErr w:type="spellEnd"/>
+      <w:r>
+        <w:rPr>
+          <w:b w:val="0"/>
+          <w:spacing w:val="-2"/>
+          <w:lang w:val="es-VE"/>
+        </w:rPr>
+        <w:t xml:space="preserve"> (2012), la confiabilidad de un instrumento de medición se define como "la ausencia de error aleatorio en un instrumento de recolección de datos" (p. 164). En otras palabras, representa el grado en que la aplicación repetida del cuestionario al mismo sujeto u objeto de estudio produce resultados consistentes y coherentes.</w:t>
+      </w:r>
+      <w:r>
+        <w:rPr>
+          <w:b w:val="0"/>
+          <w:spacing w:val="-2"/>
+          <w:lang w:val="es-VE"/>
+        </w:rPr>
+        <w:t xml:space="preserve"> </w:t>
+      </w:r>
+      <w:r>
+        <w:rPr>
+          <w:b w:val="0"/>
+          <w:spacing w:val="-2"/>
+          <w:lang w:val="es-VE"/>
+        </w:rPr>
+        <w:t xml:space="preserve">Dada la naturaleza del instrumento diseñado para esta investigación, el cual consiste en un cuestionario con ítems de respuesta múltiple estructurados bajo una escala de estimación tipo Likert, la confiabilidad se determinará estadísticamente a través del coeficiente de Alfa de </w:t>
+      </w:r>
+      <w:proofErr w:type="spellStart"/>
+      <w:r>
+        <w:rPr>
+          <w:b w:val="0"/>
+          <w:spacing w:val="-2"/>
+          <w:lang w:val="es-VE"/>
+        </w:rPr>
+        <w:t>Cronbach</w:t>
+      </w:r>
+      <w:proofErr w:type="spellEnd"/>
+      <w:r>
+        <w:rPr>
+          <w:b w:val="0"/>
+          <w:spacing w:val="-2"/>
+          <w:lang w:val="es-VE"/>
+        </w:rPr>
+        <w:t xml:space="preserve">. Este método es el indicado para instrumentos con múltiples opciones de respuesta </w:t>
+      </w:r>
+      <w:proofErr w:type="spellStart"/>
+      <w:r>
+        <w:rPr>
+          <w:b w:val="0"/>
+          <w:spacing w:val="-2"/>
+          <w:lang w:val="es-VE"/>
+        </w:rPr>
+        <w:t>policotómicas</w:t>
+      </w:r>
+      <w:proofErr w:type="spellEnd"/>
+      <w:r>
+        <w:rPr>
+          <w:b w:val="0"/>
+          <w:spacing w:val="-2"/>
+          <w:lang w:val="es-VE"/>
+        </w:rPr>
+        <w:t>.</w:t>
       </w:r>
       <w:r>
         <w:rPr>
@@ -9283,7 +10081,15 @@
         </w:sectPr>
       </w:pPr>
       <w:r>
-        <w:t>Los resultados y el análisis estadístico de los datos obtenidos tras la aplicación del instrumento a la población de estudio se procesarán mediante la estadística descriptiva. Para ello, se utilizarán herramientas informáticas de hojas de cálculo (como las versiones recientes de Microsoft Excel), donde los datos serán tabulados y presentados a través de frecuencias y porcentajes. Este procesamiento numérico permitirá analizar las dimensiones establecidas en el cuadro de operacionalización para confirmar, de manera objetiva, la necesidad de implementar la plataforma de automatización (interfaz Web, API e Inteligencia Artificial) en el colegio. Relacionando este punto, Chávez (2001) señala que la tabulación “es una técnica que emplea el investigador para procesar la información recolectada, la cual permite lograr la organización de los datos relativos a una variable, indicadores o ítems” (p. 187). Asimismo, para facilitar la comprensión visual de los hallazgos ante la directiva y los expertos, los resultados tabulados se representarán gráficamente mediante tablas de distribución de frecuencias y diagramas, sirviendo como base empírica para la Fase de Diseño del proyecto.</w:t>
+        <w:t xml:space="preserve">Los resultados y el análisis estadístico de los datos obtenidos tras la aplicación del instrumento a la población de estudio se procesarán mediante la estadística descriptiva. Para ello, se utilizarán herramientas informáticas de hojas de cálculo (como las versiones recientes de Microsoft Excel), donde los datos serán tabulados y presentados a través de frecuencias y porcentajes. Este procesamiento numérico permitirá analizar las dimensiones establecidas en el cuadro de </w:t>
+      </w:r>
+      <w:proofErr w:type="spellStart"/>
+      <w:r>
+        <w:t>operacionalización</w:t>
+      </w:r>
+      <w:proofErr w:type="spellEnd"/>
+      <w:r>
+        <w:t xml:space="preserve"> para confirmar, de manera objetiva, la necesidad de implementar la plataforma de automatización (interfaz Web, API e Inteligencia Artificial) en el colegio. Relacionando este punto, Chávez (2001) señala que la tabulación “es una técnica que emplea el investigador para procesar la información recolectada, la cual permite lograr la organización de los datos relativos a una variable, indicadores o ítems” (p. 187). Asimismo, para facilitar la comprensión visual de los hallazgos ante la directiva y los expertos, los resultados tabulados se representarán gráficamente mediante tablas de distribución de frecuencias y diagramas, sirviendo como base empírica para la Fase de Diseño del proyecto.</w:t>
       </w:r>
     </w:p>
     <w:p>
@@ -9531,7 +10337,23 @@
           <w:b w:val="0"/>
           <w:lang w:val="es-VE"/>
         </w:rPr>
-        <w:t xml:space="preserve">Banks, A., y Porcello, E. (2020). </w:t>
+        <w:t xml:space="preserve">Banks, A., y </w:t>
+      </w:r>
+      <w:proofErr w:type="spellStart"/>
+      <w:r>
+        <w:rPr>
+          <w:b w:val="0"/>
+          <w:lang w:val="es-VE"/>
+        </w:rPr>
+        <w:t>Porcello</w:t>
+      </w:r>
+      <w:proofErr w:type="spellEnd"/>
+      <w:r>
+        <w:rPr>
+          <w:b w:val="0"/>
+          <w:lang w:val="es-VE"/>
+        </w:rPr>
+        <w:t xml:space="preserve">, E. (2020). </w:t>
       </w:r>
       <w:r>
         <w:rPr>
@@ -9549,12 +10371,21 @@
         </w:rPr>
         <w:t xml:space="preserve">. </w:t>
       </w:r>
-      <w:r>
-        <w:rPr>
-          <w:b w:val="0"/>
-          <w:lang w:val="es-VE"/>
-        </w:rPr>
-        <w:t>O'Reilly Media.</w:t>
+      <w:proofErr w:type="spellStart"/>
+      <w:r>
+        <w:rPr>
+          <w:b w:val="0"/>
+          <w:lang w:val="es-VE"/>
+        </w:rPr>
+        <w:t>O'Reilly</w:t>
+      </w:r>
+      <w:proofErr w:type="spellEnd"/>
+      <w:r>
+        <w:rPr>
+          <w:b w:val="0"/>
+          <w:lang w:val="es-VE"/>
+        </w:rPr>
+        <w:t xml:space="preserve"> Media.</w:t>
       </w:r>
     </w:p>
     <w:p>
@@ -9624,7 +10455,23 @@
           <w:b w:val="0"/>
           <w:lang w:val="es-VE"/>
         </w:rPr>
-        <w:t xml:space="preserve">Cantillo, L., Roura, M., y Sánchez, A. (2015). </w:t>
+        <w:t xml:space="preserve">Cantillo, L., </w:t>
+      </w:r>
+      <w:proofErr w:type="spellStart"/>
+      <w:r>
+        <w:rPr>
+          <w:b w:val="0"/>
+          <w:lang w:val="es-VE"/>
+        </w:rPr>
+        <w:t>Roura</w:t>
+      </w:r>
+      <w:proofErr w:type="spellEnd"/>
+      <w:r>
+        <w:rPr>
+          <w:b w:val="0"/>
+          <w:lang w:val="es-VE"/>
+        </w:rPr>
+        <w:t xml:space="preserve">, M., y Sánchez, A. (2015). </w:t>
       </w:r>
       <w:r>
         <w:rPr>
@@ -9791,12 +10638,21 @@
           <w:lang w:val="en-US"/>
         </w:rPr>
       </w:pPr>
-      <w:r>
-        <w:rPr>
-          <w:b w:val="0"/>
-          <w:lang w:val="es-VE"/>
-        </w:rPr>
-        <w:t xml:space="preserve">Eskoufias, E., y Parker, S. W. (2001). </w:t>
+      <w:proofErr w:type="spellStart"/>
+      <w:r>
+        <w:rPr>
+          <w:b w:val="0"/>
+          <w:lang w:val="es-VE"/>
+        </w:rPr>
+        <w:t>Eskoufias</w:t>
+      </w:r>
+      <w:proofErr w:type="spellEnd"/>
+      <w:r>
+        <w:rPr>
+          <w:b w:val="0"/>
+          <w:lang w:val="es-VE"/>
+        </w:rPr>
+        <w:t xml:space="preserve">, E., y Parker, S. W. (2001). </w:t>
       </w:r>
       <w:r>
         <w:rPr>
@@ -9805,6 +10661,7 @@
         </w:rPr>
         <w:t xml:space="preserve">Conditional Cash Transfers and Their Impact on Child Work and Schooling: Evidence from the PROGRESA Program in Mexico. </w:t>
       </w:r>
+      <w:proofErr w:type="spellStart"/>
       <w:r>
         <w:rPr>
           <w:b w:val="0"/>
@@ -9814,6 +10671,7 @@
         </w:rPr>
         <w:t>Economía</w:t>
       </w:r>
+      <w:proofErr w:type="spellEnd"/>
       <w:r>
         <w:rPr>
           <w:b w:val="0"/>
@@ -9841,12 +10699,21 @@
           <w:lang w:val="en-US"/>
         </w:rPr>
       </w:pPr>
+      <w:proofErr w:type="spellStart"/>
       <w:r>
         <w:rPr>
           <w:b w:val="0"/>
           <w:lang w:val="en-US"/>
         </w:rPr>
-        <w:t xml:space="preserve">García, E., y Weiss, E. (2023). Student absenteeism: Who misses school and how missing school matters for performance. </w:t>
+        <w:t>García</w:t>
+      </w:r>
+      <w:proofErr w:type="spellEnd"/>
+      <w:r>
+        <w:rPr>
+          <w:b w:val="0"/>
+          <w:lang w:val="en-US"/>
+        </w:rPr>
+        <w:t xml:space="preserve">, E., y Weiss, E. (2023). Student absenteeism: Who misses school and how missing school matters for performance. </w:t>
       </w:r>
       <w:r>
         <w:rPr>
@@ -10001,7 +10868,23 @@
           <w:b w:val="0"/>
           <w:lang w:val="es-VE"/>
         </w:rPr>
-        <w:t>. Fundación Sypal.</w:t>
+        <w:t xml:space="preserve">. Fundación </w:t>
+      </w:r>
+      <w:proofErr w:type="spellStart"/>
+      <w:r>
+        <w:rPr>
+          <w:b w:val="0"/>
+          <w:lang w:val="es-VE"/>
+        </w:rPr>
+        <w:t>Sypal</w:t>
+      </w:r>
+      <w:proofErr w:type="spellEnd"/>
+      <w:r>
+        <w:rPr>
+          <w:b w:val="0"/>
+          <w:lang w:val="es-VE"/>
+        </w:rPr>
+        <w:t>.</w:t>
       </w:r>
     </w:p>
     <w:p>
@@ -10027,8 +10910,19 @@
           <w:iCs/>
           <w:lang w:val="es-VE"/>
         </w:rPr>
-        <w:t>Aplicativo web para la mejora del control de asistencias de los estudiantes de la Institución Educativa César Vallejo de Champacco</w:t>
-      </w:r>
+        <w:t xml:space="preserve">Aplicativo web para la mejora del control de asistencias de los estudiantes de la Institución Educativa César Vallejo de </w:t>
+      </w:r>
+      <w:proofErr w:type="spellStart"/>
+      <w:r>
+        <w:rPr>
+          <w:b w:val="0"/>
+          <w:i/>
+          <w:iCs/>
+          <w:lang w:val="es-VE"/>
+        </w:rPr>
+        <w:t>Champacco</w:t>
+      </w:r>
+      <w:proofErr w:type="spellEnd"/>
       <w:r>
         <w:rPr>
           <w:b w:val="0"/>
@@ -10063,12 +10957,21 @@
           <w:lang w:val="en-US"/>
         </w:rPr>
       </w:pPr>
+      <w:proofErr w:type="spellStart"/>
       <w:r>
         <w:rPr>
           <w:b w:val="0"/>
           <w:lang w:val="en-US"/>
         </w:rPr>
-        <w:t xml:space="preserve">Lauret, A. (2019). </w:t>
+        <w:t>Lauret</w:t>
+      </w:r>
+      <w:proofErr w:type="spellEnd"/>
+      <w:r>
+        <w:rPr>
+          <w:b w:val="0"/>
+          <w:lang w:val="en-US"/>
+        </w:rPr>
+        <w:t xml:space="preserve">, A. (2019). </w:t>
       </w:r>
       <w:r>
         <w:rPr>
@@ -10084,7 +10987,23 @@
           <w:b w:val="0"/>
           <w:lang w:val="en-US"/>
         </w:rPr>
-        <w:t>. Manning Publications.</w:t>
+        <w:t xml:space="preserve">. </w:t>
+      </w:r>
+      <w:proofErr w:type="gramStart"/>
+      <w:r>
+        <w:rPr>
+          <w:b w:val="0"/>
+          <w:lang w:val="en-US"/>
+        </w:rPr>
+        <w:t>Manning</w:t>
+      </w:r>
+      <w:proofErr w:type="gramEnd"/>
+      <w:r>
+        <w:rPr>
+          <w:b w:val="0"/>
+          <w:lang w:val="en-US"/>
+        </w:rPr>
+        <w:t xml:space="preserve"> Publications.</w:t>
       </w:r>
     </w:p>
     <w:p>
@@ -10149,12 +11068,21 @@
           <w:lang w:val="es-VE"/>
         </w:rPr>
       </w:pPr>
-      <w:r>
-        <w:rPr>
-          <w:b w:val="0"/>
-          <w:lang w:val="es-VE"/>
-        </w:rPr>
-        <w:t xml:space="preserve">Neill, D. A., y Cortez, L. (2018). </w:t>
+      <w:proofErr w:type="spellStart"/>
+      <w:r>
+        <w:rPr>
+          <w:b w:val="0"/>
+          <w:lang w:val="es-VE"/>
+        </w:rPr>
+        <w:t>Neill</w:t>
+      </w:r>
+      <w:proofErr w:type="spellEnd"/>
+      <w:r>
+        <w:rPr>
+          <w:b w:val="0"/>
+          <w:lang w:val="es-VE"/>
+        </w:rPr>
+        <w:t xml:space="preserve">, D. A., y Cortez, L. (2018). </w:t>
       </w:r>
       <w:r>
         <w:rPr>
@@ -10170,7 +11098,23 @@
           <w:b w:val="0"/>
           <w:lang w:val="es-VE"/>
         </w:rPr>
-        <w:t>. Editorial Utmach.</w:t>
+        <w:t xml:space="preserve">. Editorial </w:t>
+      </w:r>
+      <w:proofErr w:type="spellStart"/>
+      <w:r>
+        <w:rPr>
+          <w:b w:val="0"/>
+          <w:lang w:val="es-VE"/>
+        </w:rPr>
+        <w:t>Utmach</w:t>
+      </w:r>
+      <w:proofErr w:type="spellEnd"/>
+      <w:r>
+        <w:rPr>
+          <w:b w:val="0"/>
+          <w:lang w:val="es-VE"/>
+        </w:rPr>
+        <w:t>.</w:t>
       </w:r>
     </w:p>
     <w:p>
@@ -10206,7 +11150,27 @@
           <w:iCs/>
           <w:lang w:val="es-VE"/>
         </w:rPr>
-        <w:t>Sistema de Información Automatizado de Control de Calificaciones de los Estudiantes Gestión del Centro de Capacitación de Jóvenes y Adultos “Arturo Sarco Villena” Turmero Estado-Aragua</w:t>
+        <w:t xml:space="preserve">Sistema de Información Automatizado de Control de Calificaciones de los Estudiantes Gestión del Centro de Capacitación de Jóvenes y Adultos “Arturo </w:t>
+      </w:r>
+      <w:proofErr w:type="spellStart"/>
+      <w:r>
+        <w:rPr>
+          <w:b w:val="0"/>
+          <w:i/>
+          <w:iCs/>
+          <w:lang w:val="es-VE"/>
+        </w:rPr>
+        <w:t>Sarco</w:t>
+      </w:r>
+      <w:proofErr w:type="spellEnd"/>
+      <w:r>
+        <w:rPr>
+          <w:b w:val="0"/>
+          <w:i/>
+          <w:iCs/>
+          <w:lang w:val="es-VE"/>
+        </w:rPr>
+        <w:t xml:space="preserve"> Villena” Turmero Estado-Aragua</w:t>
       </w:r>
       <w:r>
         <w:rPr>
@@ -10240,7 +11204,23 @@
           <w:b w:val="0"/>
           <w:lang w:val="es-VE"/>
         </w:rPr>
-        <w:t xml:space="preserve">Pérez, J. (2023). La digitalización de los procesos administrativos: El papel de las APIs en la </w:t>
+        <w:t xml:space="preserve">Pérez, J. (2023). La digitalización de los procesos administrativos: El papel de las </w:t>
+      </w:r>
+      <w:proofErr w:type="spellStart"/>
+      <w:r>
+        <w:rPr>
+          <w:b w:val="0"/>
+          <w:lang w:val="es-VE"/>
+        </w:rPr>
+        <w:t>APIs</w:t>
+      </w:r>
+      <w:proofErr w:type="spellEnd"/>
+      <w:r>
+        <w:rPr>
+          <w:b w:val="0"/>
+          <w:lang w:val="es-VE"/>
+        </w:rPr>
+        <w:t xml:space="preserve"> en la </w:t>
       </w:r>
       <w:r>
         <w:rPr>
@@ -10377,7 +11357,23 @@
           <w:b w:val="0"/>
           <w:lang w:val="es-VE"/>
         </w:rPr>
-        <w:t xml:space="preserve">Russell, S., y Norvig, P. (2022). </w:t>
+        <w:t xml:space="preserve">Russell, S., y </w:t>
+      </w:r>
+      <w:proofErr w:type="spellStart"/>
+      <w:r>
+        <w:rPr>
+          <w:b w:val="0"/>
+          <w:lang w:val="es-VE"/>
+        </w:rPr>
+        <w:t>Norvig</w:t>
+      </w:r>
+      <w:proofErr w:type="spellEnd"/>
+      <w:r>
+        <w:rPr>
+          <w:b w:val="0"/>
+          <w:lang w:val="es-VE"/>
+        </w:rPr>
+        <w:t xml:space="preserve">, P. (2022). </w:t>
       </w:r>
       <w:r>
         <w:rPr>
@@ -10479,7 +11475,23 @@
           <w:b w:val="0"/>
           <w:lang w:val="es-VE"/>
         </w:rPr>
-        <w:t xml:space="preserve"> (4ta ed.). Limusa.</w:t>
+        <w:t xml:space="preserve"> (4ta ed.). </w:t>
+      </w:r>
+      <w:proofErr w:type="spellStart"/>
+      <w:r>
+        <w:rPr>
+          <w:b w:val="0"/>
+          <w:lang w:val="es-VE"/>
+        </w:rPr>
+        <w:t>Limusa</w:t>
+      </w:r>
+      <w:proofErr w:type="spellEnd"/>
+      <w:r>
+        <w:rPr>
+          <w:b w:val="0"/>
+          <w:lang w:val="es-VE"/>
+        </w:rPr>
+        <w:t>.</w:t>
       </w:r>
     </w:p>
     <w:p>
@@ -10522,7 +11534,23 @@
           <w:b w:val="0"/>
           <w:lang w:val="es-VE"/>
         </w:rPr>
-        <w:t>. Fedupel.</w:t>
+        <w:t xml:space="preserve">. </w:t>
+      </w:r>
+      <w:proofErr w:type="spellStart"/>
+      <w:r>
+        <w:rPr>
+          <w:b w:val="0"/>
+          <w:lang w:val="es-VE"/>
+        </w:rPr>
+        <w:t>Fedupel</w:t>
+      </w:r>
+      <w:proofErr w:type="spellEnd"/>
+      <w:r>
+        <w:rPr>
+          <w:b w:val="0"/>
+          <w:lang w:val="es-VE"/>
+        </w:rPr>
+        <w:t>.</w:t>
       </w:r>
     </w:p>
     <w:p>
@@ -10565,7 +11593,23 @@
           <w:b w:val="0"/>
           <w:lang w:val="es-VE"/>
         </w:rPr>
-        <w:t>. Fedupel.</w:t>
+        <w:t xml:space="preserve">. </w:t>
+      </w:r>
+      <w:proofErr w:type="spellStart"/>
+      <w:r>
+        <w:rPr>
+          <w:b w:val="0"/>
+          <w:lang w:val="es-VE"/>
+        </w:rPr>
+        <w:t>Fedupel</w:t>
+      </w:r>
+      <w:proofErr w:type="spellEnd"/>
+      <w:r>
+        <w:rPr>
+          <w:b w:val="0"/>
+          <w:lang w:val="es-VE"/>
+        </w:rPr>
+        <w:t>.</w:t>
       </w:r>
     </w:p>
     <w:p>
@@ -10601,42 +11645,9 @@
           <w:iCs/>
           <w:lang w:val="es-VE"/>
         </w:rPr>
-        <w:t>Desarrollo de aplicaciones web modernas: Arquitecturas escalables con React y TypeScript</w:t>
-      </w:r>
-      <w:r>
-        <w:rPr>
-          <w:b w:val="0"/>
-          <w:lang w:val="es-VE"/>
-        </w:rPr>
-        <w:t>. Ediciones Tecnológicas.</w:t>
-      </w:r>
-    </w:p>
-    <w:p>
-      <w:pPr>
-        <w:pStyle w:val="Ttulo2"/>
-        <w:spacing w:before="1" w:line="360" w:lineRule="auto"/>
-        <w:rPr>
-          <w:b w:val="0"/>
-          <w:lang w:val="es-VE"/>
-        </w:rPr>
-      </w:pPr>
-    </w:p>
-    <w:p>
-      <w:pPr>
-        <w:pStyle w:val="Ttulo2"/>
-        <w:spacing w:before="1" w:line="360" w:lineRule="auto"/>
-        <w:rPr>
-          <w:b w:val="0"/>
-          <w:lang w:val="es-VE"/>
-        </w:rPr>
-      </w:pPr>
-      <w:r>
-        <w:rPr>
-          <w:b w:val="0"/>
-          <w:lang w:val="es-VE"/>
-        </w:rPr>
-        <w:t xml:space="preserve">Veloz, J., y Veloz, M. (2021). Sistemas automatizados de control de acceso y su impacto en la seguridad escolar. </w:t>
-      </w:r>
+        <w:t xml:space="preserve">Desarrollo de aplicaciones web modernas: Arquitecturas escalables con </w:t>
+      </w:r>
+      <w:proofErr w:type="spellStart"/>
       <w:r>
         <w:rPr>
           <w:b w:val="0"/>
@@ -10644,6 +11655,70 @@
           <w:iCs/>
           <w:lang w:val="es-VE"/>
         </w:rPr>
+        <w:t>React</w:t>
+      </w:r>
+      <w:proofErr w:type="spellEnd"/>
+      <w:r>
+        <w:rPr>
+          <w:b w:val="0"/>
+          <w:i/>
+          <w:iCs/>
+          <w:lang w:val="es-VE"/>
+        </w:rPr>
+        <w:t xml:space="preserve"> y </w:t>
+      </w:r>
+      <w:proofErr w:type="spellStart"/>
+      <w:r>
+        <w:rPr>
+          <w:b w:val="0"/>
+          <w:i/>
+          <w:iCs/>
+          <w:lang w:val="es-VE"/>
+        </w:rPr>
+        <w:t>TypeScript</w:t>
+      </w:r>
+      <w:proofErr w:type="spellEnd"/>
+      <w:r>
+        <w:rPr>
+          <w:b w:val="0"/>
+          <w:lang w:val="es-VE"/>
+        </w:rPr>
+        <w:t>. Ediciones Tecnológicas.</w:t>
+      </w:r>
+    </w:p>
+    <w:p>
+      <w:pPr>
+        <w:pStyle w:val="Ttulo2"/>
+        <w:spacing w:before="1" w:line="360" w:lineRule="auto"/>
+        <w:rPr>
+          <w:b w:val="0"/>
+          <w:lang w:val="es-VE"/>
+        </w:rPr>
+      </w:pPr>
+    </w:p>
+    <w:p>
+      <w:pPr>
+        <w:pStyle w:val="Ttulo2"/>
+        <w:spacing w:before="1" w:line="360" w:lineRule="auto"/>
+        <w:rPr>
+          <w:b w:val="0"/>
+          <w:lang w:val="es-VE"/>
+        </w:rPr>
+      </w:pPr>
+      <w:r>
+        <w:rPr>
+          <w:b w:val="0"/>
+          <w:lang w:val="es-VE"/>
+        </w:rPr>
+        <w:t xml:space="preserve">Veloz, J., y Veloz, M. (2021). Sistemas automatizados de control de acceso y su impacto en la seguridad escolar. </w:t>
+      </w:r>
+      <w:r>
+        <w:rPr>
+          <w:b w:val="0"/>
+          <w:i/>
+          <w:iCs/>
+          <w:lang w:val="es-VE"/>
+        </w:rPr>
         <w:t>Revista Tecnológica de Innovación y Educación</w:t>
       </w:r>
       <w:r>
@@ -10692,12 +11767,37 @@
           <w:b w:val="0"/>
         </w:rPr>
       </w:pPr>
-      <w:r>
-        <w:rPr>
-          <w:b w:val="0"/>
-          <w:lang w:val="es-VE"/>
-        </w:rPr>
-        <w:t xml:space="preserve">Yusuf, M. O., y Alabi, A. O. (2019). </w:t>
+      <w:proofErr w:type="spellStart"/>
+      <w:r>
+        <w:rPr>
+          <w:b w:val="0"/>
+          <w:lang w:val="es-VE"/>
+        </w:rPr>
+        <w:t>Yusuf</w:t>
+      </w:r>
+      <w:proofErr w:type="spellEnd"/>
+      <w:r>
+        <w:rPr>
+          <w:b w:val="0"/>
+          <w:lang w:val="es-VE"/>
+        </w:rPr>
+        <w:t xml:space="preserve">, M. O., y </w:t>
+      </w:r>
+      <w:proofErr w:type="spellStart"/>
+      <w:r>
+        <w:rPr>
+          <w:b w:val="0"/>
+          <w:lang w:val="es-VE"/>
+        </w:rPr>
+        <w:t>Alabi</w:t>
+      </w:r>
+      <w:proofErr w:type="spellEnd"/>
+      <w:r>
+        <w:rPr>
+          <w:b w:val="0"/>
+          <w:lang w:val="es-VE"/>
+        </w:rPr>
+        <w:t xml:space="preserve">, A. O. (2019). </w:t>
       </w:r>
       <w:r>
         <w:rPr>
@@ -10714,14 +11814,52 @@
         <w:lastRenderedPageBreak/>
         <w:t xml:space="preserve">educational planning and administration. </w:t>
       </w:r>
+      <w:proofErr w:type="spellStart"/>
       <w:r>
         <w:rPr>
           <w:b w:val="0"/>
           <w:i/>
           <w:iCs/>
         </w:rPr>
-        <w:t>Journal of Educational Management and Policy</w:t>
-      </w:r>
+        <w:t>Journal</w:t>
+      </w:r>
+      <w:proofErr w:type="spellEnd"/>
+      <w:r>
+        <w:rPr>
+          <w:b w:val="0"/>
+          <w:i/>
+          <w:iCs/>
+        </w:rPr>
+        <w:t xml:space="preserve"> of </w:t>
+      </w:r>
+      <w:proofErr w:type="spellStart"/>
+      <w:r>
+        <w:rPr>
+          <w:b w:val="0"/>
+          <w:i/>
+          <w:iCs/>
+        </w:rPr>
+        <w:t>Educational</w:t>
+      </w:r>
+      <w:proofErr w:type="spellEnd"/>
+      <w:r>
+        <w:rPr>
+          <w:b w:val="0"/>
+          <w:i/>
+          <w:iCs/>
+        </w:rPr>
+        <w:t xml:space="preserve"> Management and </w:t>
+      </w:r>
+      <w:proofErr w:type="spellStart"/>
+      <w:r>
+        <w:rPr>
+          <w:b w:val="0"/>
+          <w:i/>
+          <w:iCs/>
+        </w:rPr>
+        <w:t>Policy</w:t>
+      </w:r>
+      <w:proofErr w:type="spellEnd"/>
       <w:r>
         <w:rPr>
           <w:b w:val="0"/>
@@ -10746,12 +11884,21 @@
           <w:b w:val="0"/>
         </w:rPr>
       </w:pPr>
-      <w:r>
-        <w:rPr>
-          <w:b w:val="0"/>
-          <w:lang w:val="es-VE"/>
-        </w:rPr>
-        <w:t xml:space="preserve">Zheng, Y. (2024). </w:t>
+      <w:proofErr w:type="spellStart"/>
+      <w:r>
+        <w:rPr>
+          <w:b w:val="0"/>
+          <w:lang w:val="es-VE"/>
+        </w:rPr>
+        <w:t>Zheng</w:t>
+      </w:r>
+      <w:proofErr w:type="spellEnd"/>
+      <w:r>
+        <w:rPr>
+          <w:b w:val="0"/>
+          <w:lang w:val="es-VE"/>
+        </w:rPr>
+        <w:t xml:space="preserve">, Y. (2024). </w:t>
       </w:r>
       <w:r>
         <w:rPr>
@@ -10900,7 +12047,7 @@
                               <w:noProof/>
                               <w:spacing w:val="-5"/>
                             </w:rPr>
-                            <w:t>7</w:t>
+                            <w:t>20</w:t>
                           </w:r>
                           <w:r>
                             <w:rPr>
@@ -10966,7 +12113,7 @@
                         <w:noProof/>
                         <w:spacing w:val="-5"/>
                       </w:rPr>
-                      <w:t>7</w:t>
+                      <w:t>20</w:t>
                     </w:r>
                     <w:r>
                       <w:rPr>

</xml_diff>